<commit_message>
Staged project 2 report
</commit_message>
<xml_diff>
--- a/references/citations_for_references.docx
+++ b/references/citations_for_references.docx
@@ -15,56 +15,113 @@
     </w:p>
     <w:p/>
     <w:p>
-      <w:r>
+      <w:pPr>
         <w:rPr>
           <w:b/>
           <w:bCs/>
         </w:rPr>
-        <w:t>Paper-1</w:t>
-      </w:r>
-      <w:r>
-        <w:t>:</w:t>
+      </w:pPr>
+      <w:r>
+        <w:rPr>
+          <w:b/>
+          <w:bCs/>
+        </w:rPr>
+        <w:t xml:space="preserve">Halloy et </w:t>
+      </w:r>
+      <w:proofErr w:type="spellStart"/>
+      <w:r>
+        <w:rPr>
+          <w:b/>
+          <w:bCs/>
+        </w:rPr>
+        <w:t>al_modeling_hair_loss_PNAS</w:t>
+      </w:r>
+      <w:proofErr w:type="spellEnd"/>
+      <w:r>
+        <w:rPr>
+          <w:b/>
+          <w:bCs/>
+        </w:rPr>
+        <w:t>, 97, 2000, 8328-8333.pdf:</w:t>
       </w:r>
     </w:p>
     <w:p>
       <w:r>
-        <w:t>Dobreva, A., Comer, D., Cogan, N.G., &amp; Paus, R. (2025). Uncertainty and sensitivity analysis of hair growth duration in human scalp follicles under normal and alopecic conditions.</w:t>
+        <w:t>Halloy, J., Bernard, B. A., Loussouarn, G., &amp; Goldbeter, A. (2000). Modeling the dynamics of human hair cycles by a follicular automaton. </w:t>
+      </w:r>
+      <w:r>
+        <w:rPr>
+          <w:i/>
+          <w:iCs/>
+        </w:rPr>
+        <w:t>Proceedings of the National Academy of Sciences of the United States of America</w:t>
+      </w:r>
+      <w:r>
+        <w:t>, </w:t>
+      </w:r>
+      <w:r>
+        <w:rPr>
+          <w:i/>
+          <w:iCs/>
+        </w:rPr>
+        <w:t>97</w:t>
+      </w:r>
+      <w:r>
+        <w:t xml:space="preserve">(15), 8328–8333. </w:t>
+      </w:r>
+      <w:hyperlink r:id="rId4" w:history="1">
+        <w:r>
+          <w:rPr>
+            <w:rStyle w:val="Hyperlink"/>
+          </w:rPr>
+          <w:t>https://doi.org/10.1073/pnas.97.15.8328</w:t>
+        </w:r>
+      </w:hyperlink>
+      <w:r>
+        <w:t xml:space="preserve"> </w:t>
       </w:r>
     </w:p>
     <w:p/>
     <w:p>
-      <w:pPr>
+      <w:r>
         <w:rPr>
           <w:b/>
           <w:bCs/>
         </w:rPr>
-      </w:pPr>
-      <w:r>
+        <w:t>Paper-1</w:t>
+      </w:r>
+      <w:r>
+        <w:t>:</w:t>
+      </w:r>
+    </w:p>
+    <w:p>
+      <w:r>
+        <w:t>Dobreva, A., Comer, D., Cogan, N.G., &amp; Paus, R. (2025). Uncertainty and sensitivity analysis of hair growth duration in human scalp follicles under normal and alopecic conditions.</w:t>
+      </w:r>
+      <w:r>
+        <w:t xml:space="preserve"> </w:t>
+      </w:r>
+    </w:p>
+    <w:p/>
+    <w:p/>
+    <w:p>
+      <w:pPr>
         <w:rPr>
           <w:b/>
           <w:bCs/>
         </w:rPr>
-        <w:t>Dobreva et al_autoimmune_disorder_of_Hair_follicle_cycling.pdf</w:t>
-      </w:r>
+      </w:pPr>
       <w:r>
         <w:rPr>
           <w:b/>
           <w:bCs/>
         </w:rPr>
-        <w:t>:</w:t>
+        <w:t>Dobreva et al_autoimmune_disorder_of_Hair_follicle_cycling.pdf:</w:t>
       </w:r>
     </w:p>
     <w:p>
       <w:r>
-        <w:t xml:space="preserve">Dobreva, A., Paus, R., &amp; Cogan, N. G. (2018). </w:t>
-      </w:r>
-      <w:proofErr w:type="spellStart"/>
-      <w:r>
-        <w:t>Analysing</w:t>
-      </w:r>
-      <w:proofErr w:type="spellEnd"/>
-      <w:r>
-        <w:t xml:space="preserve"> the dynamics of a model for alopecia areata as an autoimmune disorder of hair follicle cycling. </w:t>
+        <w:t>Dobreva, A., Paus, R., &amp; Cogan, N. G. (2018). Analysing the dynamics of a model for alopecia areata as an autoimmune disorder of hair follicle cycling. </w:t>
       </w:r>
       <w:r>
         <w:rPr>
@@ -86,7 +143,7 @@
       <w:r>
         <w:t xml:space="preserve">(3), 387–407. </w:t>
       </w:r>
-      <w:hyperlink r:id="rId4" w:history="1">
+      <w:hyperlink r:id="rId5" w:history="1">
         <w:r>
           <w:rPr>
             <w:rStyle w:val="Hyperlink"/>
@@ -96,69 +153,6 @@
       </w:hyperlink>
     </w:p>
     <w:p/>
-    <w:p>
-      <w:pPr>
-        <w:rPr>
-          <w:b/>
-          <w:bCs/>
-        </w:rPr>
-      </w:pPr>
-      <w:r>
-        <w:rPr>
-          <w:b/>
-          <w:bCs/>
-        </w:rPr>
-        <w:t xml:space="preserve">Nuaimi et </w:t>
-      </w:r>
-      <w:proofErr w:type="spellStart"/>
-      <w:r>
-        <w:rPr>
-          <w:b/>
-          <w:bCs/>
-        </w:rPr>
-        <w:t>al_Hair_Cycle_Modeling_Journal</w:t>
-      </w:r>
-      <w:proofErr w:type="spellEnd"/>
-      <w:r>
-        <w:rPr>
-          <w:b/>
-          <w:bCs/>
-        </w:rPr>
-        <w:t xml:space="preserve"> of Theoretical Biology 2012</w:t>
-      </w:r>
-      <w:r>
-        <w:rPr>
-          <w:b/>
-          <w:bCs/>
-        </w:rPr>
-        <w:t>:</w:t>
-      </w:r>
-    </w:p>
-    <w:p>
-      <w:r>
-        <w:t>Al-Nuaimi, Y., Goodfellow, M., Paus, R., &amp; Baier, G. (2012). A prototypic mathematical model of the human hair cycle. </w:t>
-      </w:r>
-      <w:r>
-        <w:rPr>
-          <w:i/>
-          <w:iCs/>
-        </w:rPr>
-        <w:t>Journal of theoretical biology</w:t>
-      </w:r>
-      <w:r>
-        <w:t>, </w:t>
-      </w:r>
-      <w:r>
-        <w:rPr>
-          <w:i/>
-          <w:iCs/>
-        </w:rPr>
-        <w:t>310</w:t>
-      </w:r>
-      <w:r>
-        <w:t>, 143–159. https://doi.org/10.1016/j.jtbi.2012.05.027</w:t>
-      </w:r>
-    </w:p>
     <w:p/>
     <w:p>
       <w:pPr>
@@ -167,77 +161,40 @@
           <w:bCs/>
         </w:rPr>
       </w:pPr>
-      <w:proofErr w:type="spellStart"/>
       <w:r>
         <w:rPr>
           <w:b/>
           <w:bCs/>
         </w:rPr>
-        <w:t>Halloy</w:t>
-      </w:r>
-      <w:proofErr w:type="spellEnd"/>
+        <w:t xml:space="preserve">Nuaimi et </w:t>
+      </w:r>
+      <w:proofErr w:type="spellStart"/>
       <w:r>
         <w:rPr>
           <w:b/>
           <w:bCs/>
         </w:rPr>
-        <w:t xml:space="preserve"> et </w:t>
-      </w:r>
-      <w:proofErr w:type="spellStart"/>
+        <w:t>al_Hair_Cycle_Modeling_Journal</w:t>
+      </w:r>
+      <w:proofErr w:type="spellEnd"/>
       <w:r>
         <w:rPr>
           <w:b/>
           <w:bCs/>
         </w:rPr>
-        <w:t>al_modeling_hair_loss_PNAS</w:t>
-      </w:r>
-      <w:proofErr w:type="spellEnd"/>
-      <w:r>
-        <w:rPr>
-          <w:b/>
-          <w:bCs/>
-        </w:rPr>
-        <w:t>, 97, 2000, 8328-8333.pdf</w:t>
-      </w:r>
-      <w:r>
-        <w:rPr>
-          <w:b/>
-          <w:bCs/>
-        </w:rPr>
-        <w:t>:</w:t>
+        <w:t xml:space="preserve"> of Theoretical Biology 2012:</w:t>
       </w:r>
     </w:p>
     <w:p>
-      <w:proofErr w:type="spellStart"/>
-      <w:r>
-        <w:t>Halloy</w:t>
-      </w:r>
-      <w:proofErr w:type="spellEnd"/>
-      <w:r>
-        <w:t xml:space="preserve">, J., Bernard, B. A., </w:t>
-      </w:r>
-      <w:proofErr w:type="spellStart"/>
-      <w:r>
-        <w:t>Loussouarn</w:t>
-      </w:r>
-      <w:proofErr w:type="spellEnd"/>
-      <w:r>
-        <w:t xml:space="preserve">, G., &amp; </w:t>
-      </w:r>
-      <w:proofErr w:type="spellStart"/>
-      <w:r>
-        <w:t>Goldbeter</w:t>
-      </w:r>
-      <w:proofErr w:type="spellEnd"/>
-      <w:r>
-        <w:t>, A. (2000). Modeling the dynamics of human hair cycles by a follicular automaton. </w:t>
+      <w:r>
+        <w:t>Al-Nuaimi, Y., Goodfellow, M., Paus, R., &amp; Baier, G. (2012). A prototypic mathematical model of the human hair cycle. </w:t>
       </w:r>
       <w:r>
         <w:rPr>
           <w:i/>
           <w:iCs/>
         </w:rPr>
-        <w:t>Proceedings of the National Academy of Sciences of the United States of America</w:t>
+        <w:t>Journal of theoretical biology</w:t>
       </w:r>
       <w:r>
         <w:t>, </w:t>
@@ -247,20 +204,14 @@
           <w:i/>
           <w:iCs/>
         </w:rPr>
-        <w:t>97</w:t>
-      </w:r>
-      <w:r>
-        <w:t xml:space="preserve">(15), 8328–8333. </w:t>
-      </w:r>
-      <w:hyperlink r:id="rId5" w:history="1">
-        <w:r>
-          <w:rPr>
-            <w:rStyle w:val="Hyperlink"/>
-          </w:rPr>
-          <w:t>https://doi.org/10.1073/pnas.97.15.8328</w:t>
-        </w:r>
-      </w:hyperlink>
+        <w:t>310</w:t>
+      </w:r>
+      <w:r>
+        <w:t>, 143–159. https://doi.org/10.1016/j.jtbi.2012.05.027</w:t>
+      </w:r>
     </w:p>
+    <w:p/>
+    <w:p/>
     <w:p/>
     <w:p>
       <w:r>
@@ -911,6 +862,7 @@
   <w:style w:type="character" w:default="1" w:styleId="DefaultParagraphFont">
     <w:name w:val="Default Paragraph Font"/>
     <w:uiPriority w:val="1"/>
+    <w:semiHidden/>
     <w:unhideWhenUsed/>
   </w:style>
   <w:style w:type="table" w:default="1" w:styleId="TableNormal">

</xml_diff>